<commit_message>
Document releasing an updated GUI; refresh the README
- README: new "Getting started" (users: download the exe from the latest
  release and follow the SOP; developers: where to start), "Releasing an
  updated GUI" (check, merge to main, pick the next version, push the tag,
  watch Actions, tell users; failed runs; firmware is separate), links to
  the latest release, banner names matching the app, Quick start marked as
  the developer route, Files list updated. The old snippet that said
  `git tag v1.0.0` (now taken) is replaced.
- release.yml: header comment with the release steps.
- SOP: new 4.5 "Releasing an updated GUI (for developers)" in plain words.
- HANDOVER: v1.0.0 is released; point to the release steps.

Co-Authored-By: Claude Opus 5.5 <noreply@anthropic.com>
Claude-Session: https://claude.ai/code/session_0168zQykpFCiWMnuLtZC4oyp
</commit_message>
<xml_diff>
--- a/docs/Handover_Summary.docx
+++ b/docs/Handover_Summary.docx
@@ -1128,19 +1128,26 @@
         <w:pStyle w:val="Compact"/>
       </w:pPr>
       <w:r>
-        <w:t xml:space="preserve">Tag the handed-over commit with a version tag (e.g. </w:t>
+        <w:rPr>
+          <w:bCs/>
+          <w:b/>
+        </w:rPr>
+        <w:t xml:space="preserve">GUI release:</w:t>
+      </w:r>
+      <w:r>
+        <w:t xml:space="preserve"> </w:t>
       </w:r>
       <w:r>
         <w:rPr>
           <w:rStyle w:val="VerbatimChar"/>
         </w:rPr>
-        <w:t xml:space="preserve">git tag v1.0.0</w:t>
-      </w:r>
-      <w:r>
-        <w:t xml:space="preserve"> </w:t>
-      </w:r>
-      <w:r>
-        <w:t xml:space="preserve">then</w:t>
+        <w:t xml:space="preserve">v1.0.0</w:t>
+      </w:r>
+      <w:r>
+        <w:t xml:space="preserve"> </w:t>
+      </w:r>
+      <w:r>
+        <w:t xml:space="preserve">is published with</w:t>
       </w:r>
       <w:r>
         <w:t xml:space="preserve"> </w:t>
@@ -1149,16 +1156,19 @@
         <w:rPr>
           <w:rStyle w:val="VerbatimChar"/>
         </w:rPr>
-        <w:t xml:space="preserve">git push origin v1.0.0</w:t>
-      </w:r>
-      <w:r>
-        <w:t xml:space="preserve">). This references the firmware, software and documents</w:t>
-      </w:r>
-      <w:r>
-        <w:t xml:space="preserve"> </w:t>
-      </w:r>
-      <w:r>
-        <w:t xml:space="preserve">together, and the release workflow publishes</w:t>
+        <w:t xml:space="preserve">KneeGoniometerGUI.exe</w:t>
+      </w:r>
+      <w:r>
+        <w:t xml:space="preserve"> </w:t>
+      </w:r>
+      <w:r>
+        <w:t xml:space="preserve">on the</w:t>
+      </w:r>
+      <w:r>
+        <w:t xml:space="preserve"> </w:t>
+      </w:r>
+      <w:r>
+        <w:t xml:space="preserve">Releases page (tag on</w:t>
       </w:r>
       <w:r>
         <w:t xml:space="preserve"> </w:t>
@@ -1167,25 +1177,49 @@
         <w:rPr>
           <w:rStyle w:val="VerbatimChar"/>
         </w:rPr>
-        <w:t xml:space="preserve">KneeGoniometerGUI.exe</w:t>
-      </w:r>
-      <w:r>
-        <w:t xml:space="preserve"> </w:t>
-      </w:r>
-      <w:r>
-        <w:t xml:space="preserve">on the</w:t>
-      </w:r>
-      <w:r>
-        <w:t xml:space="preserve"> </w:t>
-      </w:r>
-      <w:r>
-        <w:t xml:space="preserve">Releases page, which the SOP (§4.3) tells users to download. Until a tag is</w:t>
-      </w:r>
-      <w:r>
-        <w:t xml:space="preserve"> </w:t>
-      </w:r>
-      <w:r>
-        <w:t xml:space="preserve">pushed, the Releases page is empty.</w:t>
+        <w:t xml:space="preserve">main</w:t>
+      </w:r>
+      <w:r>
+        <w:t xml:space="preserve"> </w:t>
+      </w:r>
+      <w:r>
+        <w:t xml:space="preserve">at the handover). To publish a changed GUI, follow</w:t>
+      </w:r>
+      <w:r>
+        <w:t xml:space="preserve"> </w:t>
+      </w:r>
+      <w:r>
+        <w:t xml:space="preserve">“</w:t>
+      </w:r>
+      <w:r>
+        <w:t xml:space="preserve">Releasing an updated GUI</w:t>
+      </w:r>
+      <w:r>
+        <w:t xml:space="preserve">”</w:t>
+      </w:r>
+      <w:r>
+        <w:t xml:space="preserve"> </w:t>
+      </w:r>
+      <w:r>
+        <w:t xml:space="preserve">in the README (also SOP §4.5): merge to</w:t>
+      </w:r>
+      <w:r>
+        <w:t xml:space="preserve"> </w:t>
+      </w:r>
+      <w:r>
+        <w:rPr>
+          <w:rStyle w:val="VerbatimChar"/>
+        </w:rPr>
+        <w:t xml:space="preserve">main</w:t>
+      </w:r>
+      <w:r>
+        <w:t xml:space="preserve">, push</w:t>
+      </w:r>
+      <w:r>
+        <w:t xml:space="preserve"> </w:t>
+      </w:r>
+      <w:r>
+        <w:t xml:space="preserve">the next version tag, and the release workflow builds and attaches the exe.</w:t>
       </w:r>
     </w:p>
     <w:p>

</xml_diff>

<commit_message>
SOP: update to the author's final version
Replace docs/SOP_Build_and_Use.docx with the author's final Word file
(authorship line, how to tell which board is faulty, wording tweaks) and
regenerate the Markdown mirror. HANDOVER notes the same faulty-board hint.

Co-Authored-By: Claude Opus 5.5 <noreply@anthropic.com>
Claude-Session: https://claude.ai/code/session_0168zQykpFCiWMnuLtZC4oyp
</commit_message>
<xml_diff>
--- a/docs/Handover_Summary.docx
+++ b/docs/Handover_Summary.docx
@@ -728,7 +728,13 @@
         <w:t xml:space="preserve"> </w:t>
       </w:r>
       <w:r>
-        <w:t xml:space="preserve">identified, labelled and replaced.</w:t>
+        <w:t xml:space="preserve">identified, labelled and replaced. It should be the board without the red</w:t>
+      </w:r>
+      <w:r>
+        <w:t xml:space="preserve"> </w:t>
+      </w:r>
+      <w:r>
+        <w:t xml:space="preserve">wire soldered to the 3.3 V pin; confirm before replacing it.</w:t>
       </w:r>
     </w:p>
     <w:p>

</xml_diff>